<commit_message>
feat(contract-staff): apply LC feedback to all 5 brand templates
- Bold Contract Start/End Date, Position, Salary, Allowance values (run-split)
- Probation period tokenised -> {probationMonths} (Bvlgari/Coach/Givenchy)
- Confirmation -> 'I, {name}, confirm...' (Bvlgari/Coach/Guerlain; Chanel/Givenchy already done)
- Coach footer -> new AIA Sentral registered address
- {address} paragraph forced to single line-spacing (fixes large gaps)
- Termination clauses + annual leave intentionally left unchanged (deferred)

98 tests pass; structural checks confirm all changes landed. Bold/spacing require Word eyeball.

Co-Authored-By: Claude Opus 4.8 (1M context) <noreply@anthropic.com>
</commit_message>
<xml_diff>
--- a/public/templates/my-cs-bvlgari.docx
+++ b/public/templates/my-cs-bvlgari.docx
@@ -125,6 +125,7 @@
     </w:p>
     <w:p>
       <w:pPr>
+        <w:spacing w:after="0" w:line="240" w:lineRule="auto"/>
         <w:jc w:val="both"/>
         <w:rPr>
           <w:rFonts w:ascii="Segoe UI" w:hAnsi="Segoe UI" w:cs="Segoe UI"/>
@@ -222,7 +223,25 @@
           <w:sz w:val="22"/>
           <w:szCs w:val="22"/>
         </w:rPr>
-        <w:t xml:space="preserve">We are pleased to confirm your employment with us at Agensi Pekerjaan Luxury Careers Sdn. Bhd. with effect of {startDate}, hereinafter referred to as “Luxury Careers.” During your employment with us, you will be assigned exclusively to Bvlgari Malaysia Sdn Bhd – Parfum Travel Retail which will be referred as “the Client” throughout this contract.</w:t>
+        <w:t xml:space="preserve">We are pleased to confirm your employment with us at Agensi Pekerjaan Luxury Careers Sdn. Bhd. with effect of </w:t>
+      </w:r>
+      <w:r>
+        <w:rPr>
+          <w:rFonts w:ascii="Segoe UI" w:hAnsi="Segoe UI" w:cs="Segoe UI"/>
+          <w:b/>
+          <w:bCs/>
+          <w:sz w:val="22"/>
+          <w:szCs w:val="22"/>
+        </w:rPr>
+        <w:t xml:space="preserve">{startDate}</w:t>
+      </w:r>
+      <w:r>
+        <w:rPr>
+          <w:rFonts w:ascii="Segoe UI" w:hAnsi="Segoe UI" w:cs="Segoe UI"/>
+          <w:sz w:val="22"/>
+          <w:szCs w:val="22"/>
+        </w:rPr>
+        <w:t xml:space="preserve">, hereinafter referred to as “Luxury Careers.” During your employment with us, you will be assigned exclusively to Bvlgari Malaysia Sdn Bhd – Parfum Travel Retail which will be referred as “the Client” throughout this contract.</w:t>
       </w:r>
     </w:p>
     <w:p>
@@ -315,7 +334,25 @@
           <w:b w:val="0"/>
           <w:szCs w:val="22"/>
         </w:rPr>
-        <w:t xml:space="preserve">Your designation shall be {designation}.</w:t>
+        <w:t xml:space="preserve">Your designation shall be </w:t>
+      </w:r>
+      <w:r>
+        <w:rPr>
+          <w:rFonts w:ascii="Segoe UI" w:hAnsi="Segoe UI" w:cs="Segoe UI"/>
+          <w:b/>
+          <w:bCs/>
+          <w:b w:val="0"/>
+          <w:szCs w:val="22"/>
+        </w:rPr>
+        <w:t xml:space="preserve">{designation}</w:t>
+      </w:r>
+      <w:r>
+        <w:rPr>
+          <w:rFonts w:ascii="Segoe UI" w:hAnsi="Segoe UI" w:cs="Segoe UI"/>
+          <w:b w:val="0"/>
+          <w:szCs w:val="22"/>
+        </w:rPr>
+        <w:t xml:space="preserve">.</w:t>
       </w:r>
     </w:p>
     <w:p>
@@ -516,7 +553,25 @@
           <w:sz w:val="22"/>
           <w:szCs w:val="22"/>
         </w:rPr>
-        <w:t xml:space="preserve">Your gross basic monthly salary will be RM{salaryFigure} (Ringgit Malaysia: {salaryWords} Only) per month, and you will also receive the following allowances payable at the end of each: </w:t>
+        <w:t xml:space="preserve">Your gross basic monthly salary will be RM</w:t>
+      </w:r>
+      <w:r>
+        <w:rPr>
+          <w:rFonts w:ascii="Segoe UI" w:hAnsi="Segoe UI" w:cs="Segoe UI"/>
+          <w:b/>
+          <w:bCs/>
+          <w:sz w:val="22"/>
+          <w:szCs w:val="22"/>
+        </w:rPr>
+        <w:t xml:space="preserve">{salaryFigure}</w:t>
+      </w:r>
+      <w:r>
+        <w:rPr>
+          <w:rFonts w:ascii="Segoe UI" w:hAnsi="Segoe UI" w:cs="Segoe UI"/>
+          <w:sz w:val="22"/>
+          <w:szCs w:val="22"/>
+        </w:rPr>
+        <w:t xml:space="preserve"> (Ringgit Malaysia: {salaryWords} Only) per month, and you will also receive the following allowances payable at the end of each: </w:t>
       </w:r>
     </w:p>
     <w:p>
@@ -871,7 +926,43 @@
           <w:sz w:val="22"/>
           <w:szCs w:val="22"/>
         </w:rPr>
-        <w:t xml:space="preserve">The agreed employment duration is from {startDate} to {endDate}. It may be subject to renewal based on mutual agreement between you and Luxury Careers.</w:t>
+        <w:t xml:space="preserve">The agreed employment duration is from </w:t>
+      </w:r>
+      <w:r>
+        <w:rPr>
+          <w:rFonts w:ascii="Segoe UI" w:hAnsi="Segoe UI" w:cs="Segoe UI"/>
+          <w:b/>
+          <w:bCs/>
+          <w:sz w:val="22"/>
+          <w:szCs w:val="22"/>
+        </w:rPr>
+        <w:t xml:space="preserve">{startDate}</w:t>
+      </w:r>
+      <w:r>
+        <w:rPr>
+          <w:rFonts w:ascii="Segoe UI" w:hAnsi="Segoe UI" w:cs="Segoe UI"/>
+          <w:sz w:val="22"/>
+          <w:szCs w:val="22"/>
+        </w:rPr>
+        <w:t xml:space="preserve"> to </w:t>
+      </w:r>
+      <w:r>
+        <w:rPr>
+          <w:rFonts w:ascii="Segoe UI" w:hAnsi="Segoe UI" w:cs="Segoe UI"/>
+          <w:b/>
+          <w:bCs/>
+          <w:sz w:val="22"/>
+          <w:szCs w:val="22"/>
+        </w:rPr>
+        <w:t xml:space="preserve">{endDate}</w:t>
+      </w:r>
+      <w:r>
+        <w:rPr>
+          <w:rFonts w:ascii="Segoe UI" w:hAnsi="Segoe UI" w:cs="Segoe UI"/>
+          <w:sz w:val="22"/>
+          <w:szCs w:val="22"/>
+        </w:rPr>
+        <w:t xml:space="preserve">. It may be subject to renewal based on mutual agreement between you and Luxury Careers.</w:t>
       </w:r>
     </w:p>
     <w:p>
@@ -1352,7 +1443,7 @@
           <w:sz w:val="22"/>
           <w:szCs w:val="22"/>
         </w:rPr>
-        <w:t>3</w:t>
+        <w:t>{probationMonths}</w:t>
       </w:r>
       <w:r>
         <w:rPr>
@@ -3165,7 +3256,7 @@
           <w:b/>
           <w:szCs w:val="22"/>
         </w:rPr>
-        <w:t xml:space="preserve">I confirm that I have read and accepted the terms and conditions of my employment with </w:t>
+        <w:t xml:space="preserve">I, {name}, confirm that I have read and accepted the terms and conditions of my employment with </w:t>
       </w:r>
       <w:r>
         <w:rPr>

</xml_diff>